<commit_message>
PPT/进度汇报更新: RKNN/.rknn 路线改为 llama.cpp/Ollama 约束解码
- 答辩PPT: S5三套部署表/架构图/S11总结三步, 清除过时的 RKNN NPU/.rknn 表述,
  改为 llama.cpp/Ollama 约束解码(q4 .gguf) + 动态控制
- 进度汇报docx: 技术栈/交付物/指标(/sys 内存)/下一步全部同步 llama.cpp 约束解码路线,
  dynamic_control 7->10文件, 测试 8->12用例
- 指针指标内存标注'待上板实测确认'(不再写死 <1GB)
</commit_message>
<xml_diff>
--- a/1.1模块_进度汇报.docx
+++ b/1.1模块_进度汇报.docx
@@ -1019,7 +1019,7 @@
                 <w:sz w:val="20"/>
                 <w:szCs w:val="20"/>
               </w:rPr>
-              <w:t xml:space="preserve">主文件重写为RKNN NPU版+CPU兜底+一键启动脚本</w:t>
+              <w:t>主文件重写为 llama.cpp 约束解码版 + CPU 兜底 + 一键启动脚本</w:t>
             </w:r>
           </w:p>
         </w:tc>
@@ -1196,7 +1196,7 @@
                 <w:sz w:val="20"/>
                 <w:szCs w:val="20"/>
               </w:rPr>
-              <w:t xml:space="preserve">RK3588 NPU 版（正式部署，含动态控制）</w:t>
+              <w:t>RK3588 版（正式部署，llama.cpp/Ollama 约束解码 + 动态控制）</w:t>
             </w:r>
           </w:p>
         </w:tc>
@@ -1378,7 +1378,7 @@
                 <w:sz w:val="20"/>
                 <w:szCs w:val="20"/>
               </w:rPr>
-              <w:t xml:space="preserve">dynamic_control/（7文件）</w:t>
+              <w:t>dynamic_control/（10文件）</w:t>
             </w:r>
           </w:p>
         </w:tc>
@@ -1468,7 +1468,7 @@
                 <w:sz w:val="20"/>
                 <w:szCs w:val="20"/>
               </w:rPr>
-              <w:t xml:space="preserve">集成测试 8 用例</w:t>
+              <w:t>集成测试 12 用例（含回归修复）</w:t>
             </w:r>
           </w:p>
         </w:tc>
@@ -2412,7 +2412,7 @@
           <w:sz w:val="20"/>
           <w:szCs w:val="20"/>
         </w:rPr>
-        <w:t xml:space="preserve">说明：五个 API 在三个版本（WSL / Ollama / RKNN NPU）下接口完全一致，调度员无需关心底层版本。</w:t>
+        <w:t>说明：五个 API 在三个版本（WSL / Ollama / RK3588）下接口完全一致，调度员无需关心底层版本。</w:t>
       </w:r>
     </w:p>
     <w:p>
@@ -3971,7 +3971,7 @@
                 <w:sz w:val="20"/>
                 <w:szCs w:val="20"/>
               </w:rPr>
-              <w:t xml:space="preserve">&lt;1GB（RKNN NPU int8）</w:t>
+              <w:t>&lt;1.5GB（llama.cpp q4 约束解码，待上板实测确认）</w:t>
             </w:r>
           </w:p>
         </w:tc>
@@ -4574,7 +4574,7 @@
           <w:sz w:val="21"/>
           <w:szCs w:val="21"/>
         </w:rPr>
-        <w:t xml:space="preserve">RK3588（ARM + NPU 6 TOPS + 4GB 统一内存）· RKNN（rknn-toolkit-lite2 板端推理）</w:t>
+        <w:t>RK3588（ARM + NPU 6 TOPS + 4GB 统一内存）· llama.cpp JSON-schema grammar 硬约束解码（主）+ Ollama structured outputs（备）</w:t>
       </w:r>
     </w:p>
     <w:p>
@@ -4637,7 +4637,7 @@
           <w:sz w:val="21"/>
           <w:szCs w:val="21"/>
         </w:rPr>
-        <w:t xml:space="preserve">SGLang 0.5.10 + outlines（结构化生成）</w:t>
+        <w:t>SGLang 0.5.10 + outlines（结构化生成，GPU 版参考）/ llama.cpp + Ollama（RK3588 板端约束解码）</w:t>
       </w:r>
     </w:p>
     <w:p>
@@ -4717,7 +4717,7 @@
           <w:sz w:val="21"/>
           <w:szCs w:val="21"/>
         </w:rPr>
-        <w:t xml:space="preserve">板子到手 → 转换 Qwen2.5-1.5B 为 .rknn（w8a8 int8）</w:t>
+        <w:t>板子到手 → 部署 llama.cpp / Ollama，拉取 Qwen2.5-1.5B .gguf（q4_k_m）</w:t>
       </w:r>
     </w:p>
     <w:p>

</xml_diff>